<commit_message>
Tableau des dix villes ACV : mise en page plus sobre
Co-Authored-By: Claude Opus 5.5 <noreply@anthropic.com>
Claude-Session: https://claude.ai/code/session_01C7XiPcXpETUWAHMH28sD58
</commit_message>
<xml_diff>
--- a/note_politique/villes_ACV_qui_se_demarquent.docx
+++ b/note_politique/villes_ACV_qui_se_demarquent.docx
@@ -4,18 +4,15 @@
   <w:body>
     <w:p>
       <w:pPr>
-        <w:spacing w:after="80"/>
+        <w:spacing w:after="60"/>
       </w:pPr>
       <w:r>
         <w:rPr>
-          <w:b/>
-          <w:bCs/>
-          <w:color w:val="C2255C"/>
-          <w:spacing w:val="20"/>
+          <w:color w:val="666666"/>
           <w:sz w:val="16"/>
           <w:szCs w:val="16"/>
         </w:rPr>
-        <w:t xml:space="preserve">OCDE · ÉTUDE DE CAS FRANCE · PROPOSITION À LA DGE</w:t>
+        <w:t xml:space="preserve">OCDE – Étude de cas France – Proposition à la DGE</w:t>
       </w:r>
     </w:p>
     <w:p>
@@ -24,9 +21,11 @@
       </w:pPr>
       <w:r>
         <w:rPr>
-          <w:color w:val="003087"/>
-          <w:sz w:val="36"/>
-          <w:szCs w:val="36"/>
+          <w:b/>
+          <w:bCs/>
+          <w:color w:val="1A1A1A"/>
+          <w:sz w:val="32"/>
+          <w:szCs w:val="32"/>
         </w:rPr>
         <w:t xml:space="preserve">Dix villes Action Cœur de Ville qui se démarquent</w:t>
       </w:r>
@@ -34,13 +33,13 @@
     <w:p>
       <w:pPr>
         <w:pBdr>
-          <w:bottom w:val="single" w:color="C2255C" w:sz="8"/>
+          <w:bottom w:val="single" w:color="1A1A1A" w:sz="6"/>
         </w:pBdr>
         <w:spacing w:after="200"/>
       </w:pPr>
       <w:r>
         <w:rPr>
-          <w:color w:val="595959"/>
+          <w:color w:val="666666"/>
           <w:sz w:val="18"/>
           <w:szCs w:val="18"/>
         </w:rPr>
@@ -53,7 +52,7 @@
       </w:pPr>
       <w:r>
         <w:rPr>
-          <w:color w:val="595959"/>
+          <w:color w:val="666666"/>
           <w:sz w:val="17"/>
           <w:szCs w:val="17"/>
         </w:rPr>
@@ -85,9 +84,9 @@
           <w:tcPr>
             <w:tcW w:type="dxa" w:w="1800"/>
             <w:tcBorders>
-              <w:top w:val="single" w:color="003087" w:sz="10"/>
+              <w:top w:val="single" w:color="1A1A1A" w:sz="8"/>
               <w:left w:val="none" w:color="FFFFFF" w:sz="0"/>
-              <w:bottom w:val="single" w:color="003087" w:sz="6"/>
+              <w:bottom w:val="single" w:color="1A1A1A" w:sz="4"/>
               <w:right w:val="none" w:color="FFFFFF" w:sz="0"/>
             </w:tcBorders>
             <w:tcMar>
@@ -102,7 +101,7 @@
               <w:rPr>
                 <w:b/>
                 <w:bCs/>
-                <w:color w:val="003087"/>
+                <w:color w:val="1A1A1A"/>
                 <w:sz w:val="18"/>
                 <w:szCs w:val="18"/>
               </w:rPr>
@@ -114,9 +113,9 @@
           <w:tcPr>
             <w:tcW w:type="dxa" w:w="1500"/>
             <w:tcBorders>
-              <w:top w:val="single" w:color="003087" w:sz="10"/>
+              <w:top w:val="single" w:color="1A1A1A" w:sz="8"/>
               <w:left w:val="none" w:color="FFFFFF" w:sz="0"/>
-              <w:bottom w:val="single" w:color="003087" w:sz="6"/>
+              <w:bottom w:val="single" w:color="1A1A1A" w:sz="4"/>
               <w:right w:val="none" w:color="FFFFFF" w:sz="0"/>
             </w:tcBorders>
             <w:tcMar>
@@ -131,7 +130,7 @@
               <w:rPr>
                 <w:b/>
                 <w:bCs/>
-                <w:color w:val="003087"/>
+                <w:color w:val="1A1A1A"/>
                 <w:sz w:val="18"/>
                 <w:szCs w:val="18"/>
               </w:rPr>
@@ -143,9 +142,9 @@
           <w:tcPr>
             <w:tcW w:type="dxa" w:w="6338"/>
             <w:tcBorders>
-              <w:top w:val="single" w:color="003087" w:sz="10"/>
+              <w:top w:val="single" w:color="1A1A1A" w:sz="8"/>
               <w:left w:val="none" w:color="FFFFFF" w:sz="0"/>
-              <w:bottom w:val="single" w:color="003087" w:sz="6"/>
+              <w:bottom w:val="single" w:color="1A1A1A" w:sz="4"/>
               <w:right w:val="none" w:color="FFFFFF" w:sz="0"/>
             </w:tcBorders>
             <w:tcMar>
@@ -160,7 +159,7 @@
               <w:rPr>
                 <w:b/>
                 <w:bCs/>
-                <w:color w:val="003087"/>
+                <w:color w:val="1A1A1A"/>
                 <w:sz w:val="18"/>
                 <w:szCs w:val="18"/>
               </w:rPr>
@@ -194,7 +193,7 @@
               <w:rPr>
                 <w:b/>
                 <w:bCs/>
-                <w:color w:val="C2255C"/>
+                <w:color w:val="1A1A1A"/>
                 <w:sz w:val="20"/>
                 <w:szCs w:val="20"/>
               </w:rPr>
@@ -213,7 +212,7 @@
           <w:p>
             <w:r>
               <w:rPr>
-                <w:color w:val="595959"/>
+                <w:color w:val="666666"/>
                 <w:sz w:val="16"/>
                 <w:szCs w:val="16"/>
               </w:rPr>
@@ -271,7 +270,7 @@
               <w:rPr>
                 <w:b/>
                 <w:bCs/>
-                <w:color w:val="003087"/>
+                <w:color w:val="1A1A1A"/>
                 <w:sz w:val="18"/>
                 <w:szCs w:val="18"/>
               </w:rPr>
@@ -415,7 +414,7 @@
               <w:rPr>
                 <w:b/>
                 <w:bCs/>
-                <w:color w:val="C2255C"/>
+                <w:color w:val="1A1A1A"/>
                 <w:sz w:val="20"/>
                 <w:szCs w:val="20"/>
               </w:rPr>
@@ -434,7 +433,7 @@
           <w:p>
             <w:r>
               <w:rPr>
-                <w:color w:val="595959"/>
+                <w:color w:val="666666"/>
                 <w:sz w:val="16"/>
                 <w:szCs w:val="16"/>
               </w:rPr>
@@ -492,7 +491,7 @@
               <w:rPr>
                 <w:b/>
                 <w:bCs/>
-                <w:color w:val="003087"/>
+                <w:color w:val="1A1A1A"/>
                 <w:sz w:val="18"/>
                 <w:szCs w:val="18"/>
               </w:rPr>
@@ -685,7 +684,7 @@
               <w:rPr>
                 <w:b/>
                 <w:bCs/>
-                <w:color w:val="C2255C"/>
+                <w:color w:val="1A1A1A"/>
                 <w:sz w:val="20"/>
                 <w:szCs w:val="20"/>
               </w:rPr>
@@ -704,7 +703,7 @@
           <w:p>
             <w:r>
               <w:rPr>
-                <w:color w:val="595959"/>
+                <w:color w:val="666666"/>
                 <w:sz w:val="16"/>
                 <w:szCs w:val="16"/>
               </w:rPr>
@@ -762,7 +761,7 @@
               <w:rPr>
                 <w:b/>
                 <w:bCs/>
-                <w:color w:val="003087"/>
+                <w:color w:val="1A1A1A"/>
                 <w:sz w:val="18"/>
                 <w:szCs w:val="18"/>
               </w:rPr>
@@ -923,7 +922,7 @@
               <w:rPr>
                 <w:b/>
                 <w:bCs/>
-                <w:color w:val="C2255C"/>
+                <w:color w:val="1A1A1A"/>
                 <w:sz w:val="20"/>
                 <w:szCs w:val="20"/>
               </w:rPr>
@@ -942,7 +941,7 @@
           <w:p>
             <w:r>
               <w:rPr>
-                <w:color w:val="595959"/>
+                <w:color w:val="666666"/>
                 <w:sz w:val="16"/>
                 <w:szCs w:val="16"/>
               </w:rPr>
@@ -1000,7 +999,7 @@
               <w:rPr>
                 <w:b/>
                 <w:bCs/>
-                <w:color w:val="003087"/>
+                <w:color w:val="1A1A1A"/>
                 <w:sz w:val="18"/>
                 <w:szCs w:val="18"/>
               </w:rPr>
@@ -1144,7 +1143,7 @@
               <w:rPr>
                 <w:b/>
                 <w:bCs/>
-                <w:color w:val="C2255C"/>
+                <w:color w:val="1A1A1A"/>
                 <w:sz w:val="20"/>
                 <w:szCs w:val="20"/>
               </w:rPr>
@@ -1163,7 +1162,7 @@
           <w:p>
             <w:r>
               <w:rPr>
-                <w:color w:val="595959"/>
+                <w:color w:val="666666"/>
                 <w:sz w:val="16"/>
                 <w:szCs w:val="16"/>
               </w:rPr>
@@ -1221,7 +1220,7 @@
               <w:rPr>
                 <w:b/>
                 <w:bCs/>
-                <w:color w:val="003087"/>
+                <w:color w:val="1A1A1A"/>
                 <w:sz w:val="18"/>
                 <w:szCs w:val="18"/>
               </w:rPr>
@@ -1390,7 +1389,7 @@
               <w:rPr>
                 <w:b/>
                 <w:bCs/>
-                <w:color w:val="C2255C"/>
+                <w:color w:val="1A1A1A"/>
                 <w:sz w:val="20"/>
                 <w:szCs w:val="20"/>
               </w:rPr>
@@ -1409,7 +1408,7 @@
           <w:p>
             <w:r>
               <w:rPr>
-                <w:color w:val="595959"/>
+                <w:color w:val="666666"/>
                 <w:sz w:val="16"/>
                 <w:szCs w:val="16"/>
               </w:rPr>
@@ -1467,7 +1466,7 @@
               <w:rPr>
                 <w:b/>
                 <w:bCs/>
-                <w:color w:val="003087"/>
+                <w:color w:val="1A1A1A"/>
                 <w:sz w:val="18"/>
                 <w:szCs w:val="18"/>
               </w:rPr>
@@ -1594,7 +1593,7 @@
               <w:rPr>
                 <w:b/>
                 <w:bCs/>
-                <w:color w:val="C2255C"/>
+                <w:color w:val="1A1A1A"/>
                 <w:sz w:val="20"/>
                 <w:szCs w:val="20"/>
               </w:rPr>
@@ -1613,7 +1612,7 @@
           <w:p>
             <w:r>
               <w:rPr>
-                <w:color w:val="595959"/>
+                <w:color w:val="666666"/>
                 <w:sz w:val="16"/>
                 <w:szCs w:val="16"/>
               </w:rPr>
@@ -1671,7 +1670,7 @@
               <w:rPr>
                 <w:b/>
                 <w:bCs/>
-                <w:color w:val="003087"/>
+                <w:color w:val="1A1A1A"/>
                 <w:sz w:val="18"/>
                 <w:szCs w:val="18"/>
               </w:rPr>
@@ -1808,7 +1807,7 @@
               <w:rPr>
                 <w:b/>
                 <w:bCs/>
-                <w:color w:val="C2255C"/>
+                <w:color w:val="1A1A1A"/>
                 <w:sz w:val="20"/>
                 <w:szCs w:val="20"/>
               </w:rPr>
@@ -1827,7 +1826,7 @@
           <w:p>
             <w:r>
               <w:rPr>
-                <w:color w:val="595959"/>
+                <w:color w:val="666666"/>
                 <w:sz w:val="16"/>
                 <w:szCs w:val="16"/>
               </w:rPr>
@@ -1885,7 +1884,7 @@
               <w:rPr>
                 <w:b/>
                 <w:bCs/>
-                <w:color w:val="003087"/>
+                <w:color w:val="1A1A1A"/>
                 <w:sz w:val="18"/>
                 <w:szCs w:val="18"/>
               </w:rPr>
@@ -2038,7 +2037,7 @@
               <w:rPr>
                 <w:b/>
                 <w:bCs/>
-                <w:color w:val="C2255C"/>
+                <w:color w:val="1A1A1A"/>
                 <w:sz w:val="20"/>
                 <w:szCs w:val="20"/>
               </w:rPr>
@@ -2057,7 +2056,7 @@
           <w:p>
             <w:r>
               <w:rPr>
-                <w:color w:val="595959"/>
+                <w:color w:val="666666"/>
                 <w:sz w:val="16"/>
                 <w:szCs w:val="16"/>
               </w:rPr>
@@ -2115,7 +2114,7 @@
               <w:rPr>
                 <w:b/>
                 <w:bCs/>
-                <w:color w:val="003087"/>
+                <w:color w:val="1A1A1A"/>
                 <w:sz w:val="18"/>
                 <w:szCs w:val="18"/>
               </w:rPr>
@@ -2253,7 +2252,7 @@
             <w:tcBorders>
               <w:top w:val="none" w:color="FFFFFF" w:sz="0"/>
               <w:left w:val="none" w:color="FFFFFF" w:sz="0"/>
-              <w:bottom w:val="single" w:color="003087" w:sz="10"/>
+              <w:bottom w:val="single" w:color="1A1A1A" w:sz="8"/>
               <w:right w:val="none" w:color="FFFFFF" w:sz="0"/>
             </w:tcBorders>
             <w:tcMar>
@@ -2268,7 +2267,7 @@
               <w:rPr>
                 <w:b/>
                 <w:bCs/>
-                <w:color w:val="C2255C"/>
+                <w:color w:val="1A1A1A"/>
                 <w:sz w:val="20"/>
                 <w:szCs w:val="20"/>
               </w:rPr>
@@ -2287,7 +2286,7 @@
           <w:p>
             <w:r>
               <w:rPr>
-                <w:color w:val="595959"/>
+                <w:color w:val="666666"/>
                 <w:sz w:val="16"/>
                 <w:szCs w:val="16"/>
               </w:rPr>
@@ -2301,7 +2300,7 @@
             <w:tcBorders>
               <w:top w:val="none" w:color="FFFFFF" w:sz="0"/>
               <w:left w:val="none" w:color="FFFFFF" w:sz="0"/>
-              <w:bottom w:val="single" w:color="003087" w:sz="10"/>
+              <w:bottom w:val="single" w:color="1A1A1A" w:sz="8"/>
               <w:right w:val="none" w:color="FFFFFF" w:sz="0"/>
             </w:tcBorders>
             <w:tcMar>
@@ -2327,7 +2326,7 @@
             <w:tcBorders>
               <w:top w:val="none" w:color="FFFFFF" w:sz="0"/>
               <w:left w:val="none" w:color="FFFFFF" w:sz="0"/>
-              <w:bottom w:val="single" w:color="003087" w:sz="10"/>
+              <w:bottom w:val="single" w:color="1A1A1A" w:sz="8"/>
               <w:right w:val="none" w:color="FFFFFF" w:sz="0"/>
             </w:tcBorders>
             <w:tcMar>
@@ -2345,7 +2344,7 @@
               <w:rPr>
                 <w:b/>
                 <w:bCs/>
-                <w:color w:val="003087"/>
+                <w:color w:val="1A1A1A"/>
                 <w:sz w:val="18"/>
                 <w:szCs w:val="18"/>
               </w:rPr>
@@ -2465,7 +2464,7 @@
         </w:numPr>
         <w:spacing w:after="40"/>
       </w:pPr>
-      <w:hyperlink w:history="1" r:id="rIdq2xfxbgo5l8mtajvr66rp">
+      <w:hyperlink w:history="1" r:id="rIdmuvkyexowdq55fns6m9ev">
         <w:r>
           <w:rPr>
             <w:rStyle w:val="Hyperlink"/>
@@ -2492,7 +2491,7 @@
         </w:numPr>
         <w:spacing w:after="40"/>
       </w:pPr>
-      <w:hyperlink w:history="1" r:id="rIdmmxk6svtlugm9bg7p50za">
+      <w:hyperlink w:history="1" r:id="rIdtlcaw0ykagohp94ho4k4j">
         <w:r>
           <w:rPr>
             <w:rStyle w:val="Hyperlink"/>
@@ -2512,7 +2511,7 @@
         </w:numPr>
         <w:spacing w:after="40"/>
       </w:pPr>
-      <w:hyperlink w:history="1" r:id="rIddmczk5ltlw84f-qoh6ukv">
+      <w:hyperlink w:history="1" r:id="rIdiii36t6w8iqkwqda-ipmc">
         <w:r>
           <w:rPr>
             <w:rStyle w:val="Hyperlink"/>
@@ -2539,7 +2538,7 @@
         </w:numPr>
         <w:spacing w:after="40"/>
       </w:pPr>
-      <w:hyperlink w:history="1" r:id="rIdoqpuyzt4nfn5punopecz_">
+      <w:hyperlink w:history="1" r:id="rIdcxhfgmhq8gzfojz5kstq-">
         <w:r>
           <w:rPr>
             <w:rStyle w:val="Hyperlink"/>
@@ -2559,7 +2558,7 @@
         </w:numPr>
         <w:spacing w:after="40"/>
       </w:pPr>
-      <w:hyperlink w:history="1" r:id="rIdbjdxhhdq5vymke7hzulji">
+      <w:hyperlink w:history="1" r:id="rIdhszbgcd0kjjzt-cod5wld">
         <w:r>
           <w:rPr>
             <w:rStyle w:val="Hyperlink"/>
@@ -2586,7 +2585,7 @@
         </w:numPr>
         <w:spacing w:after="40"/>
       </w:pPr>
-      <w:hyperlink w:history="1" r:id="rId8oev2cc0he14gc3doawdl">
+      <w:hyperlink w:history="1" r:id="rIdjzvp5qssah82dg8ei0lud">
         <w:r>
           <w:rPr>
             <w:rStyle w:val="Hyperlink"/>
@@ -2654,9 +2653,7 @@
     </w:pPr>
     <w:r>
       <w:rPr>
-        <w:b/>
-        <w:bCs/>
-        <w:color w:val="003087"/>
+        <w:color w:val="666666"/>
         <w:sz w:val="16"/>
         <w:szCs w:val="16"/>
       </w:rPr>
@@ -2714,7 +2711,7 @@
     </w:pPr>
     <w:r>
       <w:rPr>
-        <w:color w:val="595959"/>
+        <w:color w:val="666666"/>
         <w:sz w:val="15"/>
         <w:szCs w:val="15"/>
       </w:rPr>
@@ -2815,15 +2812,15 @@
     <w:lvl w:ilvl="0" w:tentative="1">
       <w:start w:val="1"/>
       <w:numFmt w:val="bullet"/>
-      <w:lvlText w:val="■"/>
+      <w:lvlText w:val="–"/>
       <w:lvlJc w:val="left"/>
       <w:pPr>
         <w:ind w:left="240" w:hanging="220"/>
       </w:pPr>
       <w:rPr>
-        <w:color w:val="C2255C"/>
-        <w:sz w:val="12"/>
-        <w:szCs w:val="12"/>
+        <w:color w:val="666666"/>
+        <w:sz w:val="17"/>
+        <w:szCs w:val="17"/>
       </w:rPr>
     </w:lvl>
   </w:abstractNum>
@@ -2832,15 +2829,15 @@
     <w:lvl w:ilvl="0" w:tentative="1">
       <w:start w:val="1"/>
       <w:numFmt w:val="bullet"/>
-      <w:lvlText w:val="■"/>
+      <w:lvlText w:val="–"/>
       <w:lvlJc w:val="left"/>
       <w:pPr>
         <w:ind w:left="300" w:hanging="220"/>
       </w:pPr>
       <w:rPr>
-        <w:color w:val="C2255C"/>
-        <w:sz w:val="12"/>
-        <w:szCs w:val="12"/>
+        <w:color w:val="666666"/>
+        <w:sz w:val="16"/>
+        <w:szCs w:val="16"/>
       </w:rPr>
     </w:lvl>
   </w:abstractNum>
@@ -3055,9 +3052,9 @@
       <w:rFonts w:ascii="Arial" w:cs="Arial" w:eastAsia="Arial" w:hAnsi="Arial"/>
       <w:b/>
       <w:bCs/>
-      <w:color w:val="0070C0"/>
-      <w:sz w:val="22"/>
-      <w:szCs w:val="22"/>
+      <w:color w:val="1A1A1A"/>
+      <w:sz w:val="20"/>
+      <w:szCs w:val="20"/>
     </w:rPr>
   </w:style>
 </w:styles>

</xml_diff>